<commit_message>
fix: set minimum Python version to 3.12
- Update pyproject.toml requires-python to >=3.12
- Update pyproject.toml classifiers to only 3.12 and 3.13
- Update CI workflow to test only Python 3.12
- Update README.md badge and requirements section
- Update CONTRIBUTING.md prerequisites
- Update test assertion for new Python version

Fixes CI failures on Python 3.9 (union type syntax) and 3.10 (tomllib module)
</commit_message>
<xml_diff>
--- a/docs/prompt.docx
+++ b/docs/prompt.docx
@@ -539,13 +539,19 @@
     </w:p>
     <w:p>
       <w:r>
-        <w:t>Your primary task is to analyse, recommend and implement a solution for the current application blocker, attached in the ‘api.log’ file</w:t>
+        <w:t>Your primary task is to analyse, recommend and implement a solution for the current application blocker, attached in the ‘</w:t>
+      </w:r>
+      <w:r>
+        <w:t>error.txt</w:t>
+      </w:r>
+      <w:r>
+        <w:t>’ file</w:t>
       </w:r>
       <w:r>
         <w:t>.</w:t>
       </w:r>
       <w:r>
-        <w:t xml:space="preserve"> The solution should be compatible with both the local and staging/production infrastructure options. Should any additional context be required from previously delivered components, you can refer to existing code or dedicated phase context summaries, where the naming convention is ‘</w:t>
+        <w:t xml:space="preserve"> Should any additional context be required from previously delivered components, you can refer to existing code or dedicated phase context summaries, where the naming convention is ‘</w:t>
       </w:r>
       <w:r>
         <w:t>implementation-context-phase</w:t>
@@ -557,32 +563,26 @@
         <w:t>x</w:t>
       </w:r>
       <w:r>
+        <w:t>.md</w:t>
+      </w:r>
+      <w:r>
+        <w:t>’, where the ‘x’ is the phase number. Any code produced must be complete and production ready. Do not</w:t>
+      </w:r>
+      <w:r>
+        <w:t xml:space="preserve"> partially implement anything, I would rather a complete working component than a bunch of place holders</w:t>
+      </w:r>
+      <w:r>
+        <w:t xml:space="preserve"> or production </w:t>
+      </w:r>
+      <w:proofErr w:type="spellStart"/>
+      <w:r>
+        <w:t>todo’s</w:t>
+      </w:r>
+      <w:proofErr w:type="spellEnd"/>
+      <w:r>
         <w:t>.</w:t>
       </w:r>
       <w:r>
-        <w:t>x</w:t>
-      </w:r>
-      <w:r>
-        <w:t>.md</w:t>
-      </w:r>
-      <w:r>
-        <w:t>’, where the ‘x-x’ is the phase number. Any code produced must be complete and production ready. Do not</w:t>
-      </w:r>
-      <w:r>
-        <w:t xml:space="preserve"> partially implement anything, I would rather a complete working component than a bunch of place holders</w:t>
-      </w:r>
-      <w:r>
-        <w:t xml:space="preserve"> or production </w:t>
-      </w:r>
-      <w:proofErr w:type="spellStart"/>
-      <w:r>
-        <w:t>todo’s</w:t>
-      </w:r>
-      <w:proofErr w:type="spellEnd"/>
-      <w:r>
-        <w:t>.</w:t>
-      </w:r>
-      <w:r>
         <w:t xml:space="preserve"> This will be production code, so</w:t>
       </w:r>
       <w:r>
@@ -609,46 +609,7 @@
       </w:r>
       <w:proofErr w:type="gramEnd"/>
       <w:r>
-        <w:t xml:space="preserve"> questions where the implementation phase overview and subsequent documentation for a component is unclear and functionality confirmation is needed. </w:t>
-      </w:r>
-      <w:r>
-        <w:t xml:space="preserve">Environment variables </w:t>
-      </w:r>
-      <w:r>
-        <w:t>must</w:t>
-      </w:r>
-      <w:r>
-        <w:t xml:space="preserve"> be loaded for use from the ‘apps/</w:t>
-      </w:r>
-      <w:proofErr w:type="spellStart"/>
-      <w:r>
-        <w:t>api</w:t>
-      </w:r>
-      <w:proofErr w:type="spellEnd"/>
-      <w:proofErr w:type="gramStart"/>
-      <w:r>
-        <w:t>/.</w:t>
-      </w:r>
-      <w:proofErr w:type="spellStart"/>
-      <w:r>
-        <w:t>env</w:t>
-      </w:r>
-      <w:proofErr w:type="gramEnd"/>
-      <w:r>
-        <w:t>.local</w:t>
-      </w:r>
-      <w:proofErr w:type="spellEnd"/>
-      <w:r>
-        <w:t>’ file</w:t>
-      </w:r>
-      <w:r>
-        <w:t xml:space="preserve">, </w:t>
-      </w:r>
-      <w:r>
-        <w:t>before running terminal commands</w:t>
-      </w:r>
-      <w:r>
-        <w:t xml:space="preserve">. Always </w:t>
+        <w:t xml:space="preserve"> questions where the implementation phase overview and subsequent documentation for a component is unclear and functionality confirmation is needed. Always </w:t>
       </w:r>
       <w:r>
         <w:t>remember to activate the virtual environment before running terminal commands</w:t>
@@ -670,32 +631,14 @@
         <w:t>/bin/activate</w:t>
       </w:r>
       <w:r>
-        <w:t>’). Helpful commands are available in the ‘</w:t>
-      </w:r>
-      <w:r>
-        <w:t>copilot-instructions.md</w:t>
-      </w:r>
-      <w:r>
-        <w:t xml:space="preserve">’ document, under section 11: </w:t>
-      </w:r>
-      <w:proofErr w:type="spellStart"/>
-      <w:r>
-        <w:t>Quickstart</w:t>
-      </w:r>
-      <w:proofErr w:type="spellEnd"/>
-      <w:r>
-        <w:t>. Use the app-composer profile when running AWS commands, including CDK commands.</w:t>
+        <w:t>’).</w:t>
       </w:r>
     </w:p>
     <w:p/>
     <w:p/>
     <w:p>
       <w:r>
-        <w:t xml:space="preserve">Should any additional context be required from previously delivered components, you can refer to existing code or dedicated phase context summaries, where the naming </w:t>
-      </w:r>
-      <w:r>
-        <w:lastRenderedPageBreak/>
-        <w:t>convention is ‘</w:t>
+        <w:t>Should any additional context be required from previously delivered components, you can refer to existing code or dedicated phase context summaries, where the naming convention is ‘</w:t>
       </w:r>
       <w:r>
         <w:t>implementation-context-phase</w:t>

</xml_diff>